<commit_message>
assignment 1 linux basics
</commit_message>
<xml_diff>
--- a/Sahil Shaikh Assignment_1_Linux_Basics.docx
+++ b/Sahil Shaikh Assignment_1_Linux_Basics.docx
@@ -5,6 +5,7 @@
     <w:p>
       <w:pPr>
         <w:spacing w:after="280" w:before="280" w:line="240" w:lineRule="auto"/>
+        <w:jc w:val="center"/>
         <w:rPr>
           <w:rFonts w:ascii="DM Sans" w:cs="DM Sans" w:eastAsia="DM Sans" w:hAnsi="DM Sans"/>
           <w:b w:val="1"/>
@@ -22,6 +23,29 @@
           <w:szCs w:val="26"/>
           <w:rtl w:val="0"/>
         </w:rPr>
+        <w:t xml:space="preserve">ASSIGNMENT 1: LINUX BASICS</w:t>
+      </w:r>
+    </w:p>
+    <w:p>
+      <w:pPr>
+        <w:spacing w:after="280" w:before="280" w:line="240" w:lineRule="auto"/>
+        <w:rPr>
+          <w:rFonts w:ascii="DM Sans" w:cs="DM Sans" w:eastAsia="DM Sans" w:hAnsi="DM Sans"/>
+          <w:b w:val="1"/>
+          <w:bCs w:val="1"/>
+          <w:sz w:val="26"/>
+          <w:szCs w:val="26"/>
+        </w:rPr>
+      </w:pPr>
+      <w:r>
+        <w:rPr>
+          <w:rFonts w:ascii="DM Sans" w:cs="DM Sans" w:eastAsia="DM Sans" w:hAnsi="DM Sans"/>
+          <w:b w:val="1"/>
+          <w:bCs w:val="1"/>
+          <w:sz w:val="26"/>
+          <w:szCs w:val="26"/>
+          <w:rtl w:val="0"/>
+        </w:rPr>
         <w:t xml:space="preserve">1. Creating and Renaming Files/Directories</w:t>
       </w:r>
     </w:p>
@@ -29,7 +53,7 @@
       <w:pPr>
         <w:numPr>
           <w:ilvl w:val="0"/>
-          <w:numId w:val="6"/>
+          <w:numId w:val="8"/>
         </w:numPr>
         <w:spacing w:before="280" w:line="240" w:lineRule="auto"/>
         <w:ind w:left="720" w:hanging="360"/>
@@ -72,7 +96,7 @@
       <w:pPr>
         <w:numPr>
           <w:ilvl w:val="0"/>
-          <w:numId w:val="6"/>
+          <w:numId w:val="8"/>
         </w:numPr>
         <w:spacing w:line="240" w:lineRule="auto"/>
         <w:ind w:left="720" w:hanging="360"/>
@@ -115,7 +139,7 @@
       <w:pPr>
         <w:numPr>
           <w:ilvl w:val="0"/>
-          <w:numId w:val="6"/>
+          <w:numId w:val="8"/>
         </w:numPr>
         <w:spacing w:after="280" w:line="240" w:lineRule="auto"/>
         <w:ind w:left="720" w:hanging="360"/>
@@ -164,12 +188,12 @@
           <wp:inline distB="114300" distT="114300" distL="114300" distR="114300">
             <wp:extent cx="5731200" cy="2654300"/>
             <wp:effectExtent b="0" l="0" r="0" t="0"/>
-            <wp:docPr id="8" name="image6.png"/>
+            <wp:docPr id="9" name="image7.png"/>
             <a:graphic>
               <a:graphicData uri="http://schemas.openxmlformats.org/drawingml/2006/picture">
                 <pic:pic>
                   <pic:nvPicPr>
-                    <pic:cNvPr id="0" name="image6.png"/>
+                    <pic:cNvPr id="0" name="image7.png"/>
                     <pic:cNvPicPr preferRelativeResize="0"/>
                   </pic:nvPicPr>
                   <pic:blipFill>
@@ -201,6 +225,233 @@
     </w:p>
     <w:p>
       <w:pPr>
+        <w:spacing w:after="240" w:before="240" w:lineRule="auto"/>
+        <w:rPr>
+          <w:b w:val="1"/>
+          <w:bCs w:val="1"/>
+        </w:rPr>
+      </w:pPr>
+      <w:r>
+        <w:rPr>
+          <w:b w:val="1"/>
+          <w:bCs w:val="1"/>
+          <w:rtl w:val="0"/>
+        </w:rPr>
+        <w:t xml:space="preserve">Explanation:</w:t>
+      </w:r>
+    </w:p>
+    <w:p>
+      <w:pPr>
+        <w:numPr>
+          <w:ilvl w:val="0"/>
+          <w:numId w:val="5"/>
+        </w:numPr>
+        <w:spacing w:after="0" w:afterAutospacing="0" w:before="240" w:lineRule="auto"/>
+        <w:ind w:left="720" w:hanging="360"/>
+      </w:pPr>
+      <w:r>
+        <w:rPr>
+          <w:rFonts w:ascii="Roboto Mono" w:cs="Roboto Mono" w:eastAsia="Roboto Mono" w:hAnsi="Roboto Mono"/>
+          <w:color w:val="188038"/>
+          <w:rtl w:val="0"/>
+        </w:rPr>
+        <w:t xml:space="preserve">mkdir test_dir</w:t>
+      </w:r>
+      <w:r>
+        <w:rPr>
+          <w:rtl w:val="0"/>
+        </w:rPr>
+        <w:t xml:space="preserve">: Creates a new directory named </w:t>
+      </w:r>
+      <w:r>
+        <w:rPr>
+          <w:rFonts w:ascii="Roboto Mono" w:cs="Roboto Mono" w:eastAsia="Roboto Mono" w:hAnsi="Roboto Mono"/>
+          <w:color w:val="188038"/>
+          <w:rtl w:val="0"/>
+        </w:rPr>
+        <w:t xml:space="preserve">test_dir</w:t>
+      </w:r>
+      <w:r>
+        <w:rPr>
+          <w:rtl w:val="0"/>
+        </w:rPr>
+        <w:t xml:space="preserve">.</w:t>
+      </w:r>
+    </w:p>
+    <w:p>
+      <w:pPr>
+        <w:numPr>
+          <w:ilvl w:val="0"/>
+          <w:numId w:val="5"/>
+        </w:numPr>
+        <w:spacing w:after="0" w:afterAutospacing="0" w:before="0" w:beforeAutospacing="0" w:lineRule="auto"/>
+        <w:ind w:left="720" w:hanging="360"/>
+      </w:pPr>
+      <w:r>
+        <w:rPr>
+          <w:rFonts w:ascii="Roboto Mono" w:cs="Roboto Mono" w:eastAsia="Roboto Mono" w:hAnsi="Roboto Mono"/>
+          <w:color w:val="188038"/>
+          <w:rtl w:val="0"/>
+        </w:rPr>
+        <w:t xml:space="preserve">cd test_dir</w:t>
+      </w:r>
+      <w:r>
+        <w:rPr>
+          <w:rtl w:val="0"/>
+        </w:rPr>
+        <w:t xml:space="preserve">: Navigates into the newly created directory.</w:t>
+      </w:r>
+    </w:p>
+    <w:p>
+      <w:pPr>
+        <w:numPr>
+          <w:ilvl w:val="0"/>
+          <w:numId w:val="5"/>
+        </w:numPr>
+        <w:spacing w:after="0" w:afterAutospacing="0" w:before="0" w:beforeAutospacing="0" w:lineRule="auto"/>
+        <w:ind w:left="720" w:hanging="360"/>
+      </w:pPr>
+      <w:r>
+        <w:rPr>
+          <w:rFonts w:ascii="Roboto Mono" w:cs="Roboto Mono" w:eastAsia="Roboto Mono" w:hAnsi="Roboto Mono"/>
+          <w:color w:val="188038"/>
+          <w:rtl w:val="0"/>
+        </w:rPr>
+        <w:t xml:space="preserve">touch example.txt</w:t>
+      </w:r>
+      <w:r>
+        <w:rPr>
+          <w:rtl w:val="0"/>
+        </w:rPr>
+        <w:t xml:space="preserve">: Creates an empty file named </w:t>
+      </w:r>
+      <w:r>
+        <w:rPr>
+          <w:rFonts w:ascii="Roboto Mono" w:cs="Roboto Mono" w:eastAsia="Roboto Mono" w:hAnsi="Roboto Mono"/>
+          <w:color w:val="188038"/>
+          <w:rtl w:val="0"/>
+        </w:rPr>
+        <w:t xml:space="preserve">example.txt</w:t>
+      </w:r>
+      <w:r>
+        <w:rPr>
+          <w:rtl w:val="0"/>
+        </w:rPr>
+        <w:t xml:space="preserve">.</w:t>
+      </w:r>
+    </w:p>
+    <w:p>
+      <w:pPr>
+        <w:numPr>
+          <w:ilvl w:val="0"/>
+          <w:numId w:val="5"/>
+        </w:numPr>
+        <w:spacing w:after="0" w:afterAutospacing="0" w:before="0" w:beforeAutospacing="0" w:lineRule="auto"/>
+        <w:ind w:left="720" w:hanging="360"/>
+      </w:pPr>
+      <w:r>
+        <w:rPr>
+          <w:rFonts w:ascii="Roboto Mono" w:cs="Roboto Mono" w:eastAsia="Roboto Mono" w:hAnsi="Roboto Mono"/>
+          <w:color w:val="188038"/>
+          <w:rtl w:val="0"/>
+        </w:rPr>
+        <w:t xml:space="preserve">ls -ltr</w:t>
+      </w:r>
+      <w:r>
+        <w:rPr>
+          <w:rtl w:val="0"/>
+        </w:rPr>
+        <w:t xml:space="preserve">: Displays the files in the current directory with details such as permissions, owner, size, and modification time.</w:t>
+      </w:r>
+    </w:p>
+    <w:p>
+      <w:pPr>
+        <w:numPr>
+          <w:ilvl w:val="0"/>
+          <w:numId w:val="5"/>
+        </w:numPr>
+        <w:spacing w:after="240" w:before="0" w:beforeAutospacing="0" w:lineRule="auto"/>
+        <w:ind w:left="720" w:hanging="360"/>
+      </w:pPr>
+      <w:r>
+        <w:rPr>
+          <w:rFonts w:ascii="Roboto Mono" w:cs="Roboto Mono" w:eastAsia="Roboto Mono" w:hAnsi="Roboto Mono"/>
+          <w:color w:val="188038"/>
+          <w:rtl w:val="0"/>
+        </w:rPr>
+        <w:t xml:space="preserve">mv example.txt renamed_example.txt</w:t>
+      </w:r>
+      <w:r>
+        <w:rPr>
+          <w:rtl w:val="0"/>
+        </w:rPr>
+        <w:t xml:space="preserve">: Renames the file from </w:t>
+      </w:r>
+      <w:r>
+        <w:rPr>
+          <w:rFonts w:ascii="Roboto Mono" w:cs="Roboto Mono" w:eastAsia="Roboto Mono" w:hAnsi="Roboto Mono"/>
+          <w:color w:val="188038"/>
+          <w:rtl w:val="0"/>
+        </w:rPr>
+        <w:t xml:space="preserve">example.txt</w:t>
+      </w:r>
+      <w:r>
+        <w:rPr>
+          <w:rtl w:val="0"/>
+        </w:rPr>
+        <w:t xml:space="preserve"> to </w:t>
+      </w:r>
+      <w:r>
+        <w:rPr>
+          <w:rFonts w:ascii="Roboto Mono" w:cs="Roboto Mono" w:eastAsia="Roboto Mono" w:hAnsi="Roboto Mono"/>
+          <w:color w:val="188038"/>
+          <w:rtl w:val="0"/>
+        </w:rPr>
+        <w:t xml:space="preserve">renamed_example.txt</w:t>
+      </w:r>
+      <w:r>
+        <w:rPr>
+          <w:rtl w:val="0"/>
+        </w:rPr>
+        <w:t xml:space="preserve">.</w:t>
+      </w:r>
+    </w:p>
+    <w:p>
+      <w:pPr>
+        <w:spacing w:after="240" w:before="240" w:lineRule="auto"/>
+        <w:rPr/>
+      </w:pPr>
+      <w:r>
+        <w:rPr>
+          <w:b w:val="1"/>
+          <w:bCs w:val="1"/>
+          <w:rtl w:val="0"/>
+        </w:rPr>
+        <w:t xml:space="preserve">Result:</w:t>
+      </w:r>
+      <w:r>
+        <w:rPr>
+          <w:rtl w:val="0"/>
+        </w:rPr>
+        <w:t xml:space="preserve"> The directory was created successfully, an empty file was created inside it, and the file was renamed to </w:t>
+      </w:r>
+      <w:r>
+        <w:rPr>
+          <w:rFonts w:ascii="Roboto Mono" w:cs="Roboto Mono" w:eastAsia="Roboto Mono" w:hAnsi="Roboto Mono"/>
+          <w:color w:val="188038"/>
+          <w:rtl w:val="0"/>
+        </w:rPr>
+        <w:t xml:space="preserve">renamed_example.txt</w:t>
+      </w:r>
+      <w:r>
+        <w:rPr>
+          <w:rtl w:val="0"/>
+        </w:rPr>
+        <w:t xml:space="preserve">. The terminal output confirms that the renamed file exists.</w:t>
+      </w:r>
+    </w:p>
+    <w:p>
+      <w:pPr>
         <w:spacing w:after="280" w:before="280" w:line="240" w:lineRule="auto"/>
         <w:rPr>
           <w:rFonts w:ascii="DM Sans" w:cs="DM Sans" w:eastAsia="DM Sans" w:hAnsi="DM Sans"/>
@@ -211,12 +462,32 @@
         </w:rPr>
       </w:pPr>
       <w:r>
+        <w:br w:type="page"/>
+      </w:r>
+      <w:r>
+        <w:rPr>
+          <w:rtl w:val="0"/>
+        </w:rPr>
+      </w:r>
+    </w:p>
+    <w:p>
+      <w:pPr>
+        <w:spacing w:after="280" w:before="280" w:line="240" w:lineRule="auto"/>
         <w:rPr>
           <w:rFonts w:ascii="DM Sans" w:cs="DM Sans" w:eastAsia="DM Sans" w:hAnsi="DM Sans"/>
           <w:b w:val="1"/>
           <w:bCs w:val="1"/>
           <w:sz w:val="26"/>
           <w:szCs w:val="26"/>
+        </w:rPr>
+      </w:pPr>
+      <w:r>
+        <w:rPr>
+          <w:rFonts w:ascii="DM Sans" w:cs="DM Sans" w:eastAsia="DM Sans" w:hAnsi="DM Sans"/>
+          <w:b w:val="1"/>
+          <w:bCs w:val="1"/>
+          <w:sz w:val="26"/>
+          <w:szCs w:val="26"/>
           <w:rtl w:val="0"/>
         </w:rPr>
         <w:t xml:space="preserve">2. Viewing File Contents</w:t>
@@ -226,7 +497,7 @@
       <w:pPr>
         <w:numPr>
           <w:ilvl w:val="0"/>
-          <w:numId w:val="5"/>
+          <w:numId w:val="7"/>
         </w:numPr>
         <w:spacing w:before="280" w:line="240" w:lineRule="auto"/>
         <w:ind w:left="720" w:hanging="360"/>
@@ -269,7 +540,7 @@
       <w:pPr>
         <w:numPr>
           <w:ilvl w:val="0"/>
-          <w:numId w:val="5"/>
+          <w:numId w:val="7"/>
         </w:numPr>
         <w:spacing w:line="240" w:lineRule="auto"/>
         <w:ind w:left="720" w:hanging="360"/>
@@ -312,7 +583,7 @@
       <w:pPr>
         <w:numPr>
           <w:ilvl w:val="0"/>
-          <w:numId w:val="5"/>
+          <w:numId w:val="7"/>
         </w:numPr>
         <w:spacing w:after="280" w:line="240" w:lineRule="auto"/>
         <w:ind w:left="720" w:hanging="360"/>
@@ -366,12 +637,12 @@
           <wp:inline distB="114300" distT="114300" distL="114300" distR="114300">
             <wp:extent cx="5719763" cy="3381375"/>
             <wp:effectExtent b="0" l="0" r="0" t="0"/>
-            <wp:docPr id="6" name="image8.png"/>
+            <wp:docPr id="7" name="image9.png"/>
             <a:graphic>
               <a:graphicData uri="http://schemas.openxmlformats.org/drawingml/2006/picture">
                 <pic:pic>
                   <pic:nvPicPr>
-                    <pic:cNvPr id="0" name="image8.png"/>
+                    <pic:cNvPr id="0" name="image9.png"/>
                     <pic:cNvPicPr preferRelativeResize="0"/>
                   </pic:nvPicPr>
                   <pic:blipFill>
@@ -411,12 +682,12 @@
           <wp:inline distB="114300" distT="114300" distL="114300" distR="114300">
             <wp:extent cx="5731200" cy="2032000"/>
             <wp:effectExtent b="0" l="0" r="0" t="0"/>
-            <wp:docPr id="5" name="image7.png"/>
+            <wp:docPr id="6" name="image6.png"/>
             <a:graphic>
               <a:graphicData uri="http://schemas.openxmlformats.org/drawingml/2006/picture">
                 <pic:pic>
                   <pic:nvPicPr>
-                    <pic:cNvPr id="0" name="image7.png"/>
+                    <pic:cNvPr id="0" name="image6.png"/>
                     <pic:cNvPicPr preferRelativeResize="0"/>
                   </pic:nvPicPr>
                   <pic:blipFill>
@@ -448,6 +719,129 @@
     </w:p>
     <w:p>
       <w:pPr>
+        <w:spacing w:after="240" w:before="240" w:lineRule="auto"/>
+        <w:rPr>
+          <w:b w:val="1"/>
+          <w:bCs w:val="1"/>
+        </w:rPr>
+      </w:pPr>
+      <w:r>
+        <w:rPr>
+          <w:b w:val="1"/>
+          <w:bCs w:val="1"/>
+          <w:rtl w:val="0"/>
+        </w:rPr>
+        <w:t xml:space="preserve">Explanation:</w:t>
+      </w:r>
+    </w:p>
+    <w:p>
+      <w:pPr>
+        <w:numPr>
+          <w:ilvl w:val="0"/>
+          <w:numId w:val="4"/>
+        </w:numPr>
+        <w:spacing w:after="0" w:afterAutospacing="0" w:before="240" w:lineRule="auto"/>
+        <w:ind w:left="720" w:hanging="360"/>
+      </w:pPr>
+      <w:r>
+        <w:rPr>
+          <w:rFonts w:ascii="Roboto Mono" w:cs="Roboto Mono" w:eastAsia="Roboto Mono" w:hAnsi="Roboto Mono"/>
+          <w:color w:val="188038"/>
+          <w:rtl w:val="0"/>
+        </w:rPr>
+        <w:t xml:space="preserve">cat /etc/passwd</w:t>
+      </w:r>
+      <w:r>
+        <w:rPr>
+          <w:rtl w:val="0"/>
+        </w:rPr>
+        <w:t xml:space="preserve">: Displays the contents of the </w:t>
+      </w:r>
+      <w:r>
+        <w:rPr>
+          <w:rFonts w:ascii="Roboto Mono" w:cs="Roboto Mono" w:eastAsia="Roboto Mono" w:hAnsi="Roboto Mono"/>
+          <w:color w:val="188038"/>
+          <w:rtl w:val="0"/>
+        </w:rPr>
+        <w:t xml:space="preserve">/etc/passwd</w:t>
+      </w:r>
+      <w:r>
+        <w:rPr>
+          <w:rtl w:val="0"/>
+        </w:rPr>
+        <w:t xml:space="preserve"> file, which contains user account information on the system.</w:t>
+      </w:r>
+    </w:p>
+    <w:p>
+      <w:pPr>
+        <w:numPr>
+          <w:ilvl w:val="0"/>
+          <w:numId w:val="4"/>
+        </w:numPr>
+        <w:spacing w:after="0" w:afterAutospacing="0" w:before="0" w:beforeAutospacing="0" w:lineRule="auto"/>
+        <w:ind w:left="720" w:hanging="360"/>
+      </w:pPr>
+      <w:r>
+        <w:rPr>
+          <w:rFonts w:ascii="Roboto Mono" w:cs="Roboto Mono" w:eastAsia="Roboto Mono" w:hAnsi="Roboto Mono"/>
+          <w:color w:val="188038"/>
+          <w:rtl w:val="0"/>
+        </w:rPr>
+        <w:t xml:space="preserve">head -n 5 /etc/passwd</w:t>
+      </w:r>
+      <w:r>
+        <w:rPr>
+          <w:rtl w:val="0"/>
+        </w:rPr>
+        <w:t xml:space="preserve">: Displays the first five lines of the file.</w:t>
+      </w:r>
+    </w:p>
+    <w:p>
+      <w:pPr>
+        <w:numPr>
+          <w:ilvl w:val="0"/>
+          <w:numId w:val="4"/>
+        </w:numPr>
+        <w:spacing w:after="240" w:before="0" w:beforeAutospacing="0" w:lineRule="auto"/>
+        <w:ind w:left="720" w:hanging="360"/>
+      </w:pPr>
+      <w:r>
+        <w:rPr>
+          <w:rFonts w:ascii="Roboto Mono" w:cs="Roboto Mono" w:eastAsia="Roboto Mono" w:hAnsi="Roboto Mono"/>
+          <w:color w:val="188038"/>
+          <w:rtl w:val="0"/>
+        </w:rPr>
+        <w:t xml:space="preserve">tail -n 5 /etc/passwd</w:t>
+      </w:r>
+      <w:r>
+        <w:rPr>
+          <w:rtl w:val="0"/>
+        </w:rPr>
+        <w:t xml:space="preserve">: Displays the last five lines of the file.</w:t>
+      </w:r>
+    </w:p>
+    <w:p>
+      <w:pPr>
+        <w:spacing w:after="240" w:before="240" w:lineRule="auto"/>
+        <w:rPr/>
+      </w:pPr>
+      <w:r>
+        <w:rPr>
+          <w:b w:val="1"/>
+          <w:bCs w:val="1"/>
+          <w:rtl w:val="0"/>
+        </w:rPr>
+        <w:t xml:space="preserve">Result:</w:t>
+      </w:r>
+      <w:r>
+        <w:rPr>
+          <w:rtl w:val="0"/>
+        </w:rPr>
+        <w:t xml:space="preserve"> The commands display the complete file contents, the first five lines, and the last five lines, respectively. This demonstrates how Linux commands can be used to inspect text files.</w:t>
+      </w:r>
+    </w:p>
+    <w:p>
+      <w:pPr>
         <w:spacing w:after="280" w:before="280" w:line="240" w:lineRule="auto"/>
         <w:rPr>
           <w:rFonts w:ascii="DM Sans" w:cs="DM Sans" w:eastAsia="DM Sans" w:hAnsi="DM Sans"/>
@@ -473,7 +867,7 @@
       <w:pPr>
         <w:numPr>
           <w:ilvl w:val="0"/>
-          <w:numId w:val="7"/>
+          <w:numId w:val="9"/>
         </w:numPr>
         <w:spacing w:after="280" w:before="280" w:line="240" w:lineRule="auto"/>
         <w:ind w:left="720" w:hanging="360"/>
@@ -519,7 +913,10 @@
     </w:p>
     <w:p>
       <w:pPr>
-        <w:rPr/>
+        <w:rPr>
+          <w:rFonts w:ascii="Roboto Mono" w:cs="Roboto Mono" w:eastAsia="Roboto Mono" w:hAnsi="Roboto Mono"/>
+          <w:color w:val="188038"/>
+        </w:rPr>
       </w:pPr>
       <w:r>
         <w:rPr/>
@@ -527,12 +924,12 @@
           <wp:inline distB="114300" distT="114300" distL="114300" distR="114300">
             <wp:extent cx="5731200" cy="952500"/>
             <wp:effectExtent b="0" l="0" r="0" t="0"/>
-            <wp:docPr id="1" name="image2.png"/>
+            <wp:docPr id="1" name="image3.png"/>
             <a:graphic>
               <a:graphicData uri="http://schemas.openxmlformats.org/drawingml/2006/picture">
                 <pic:pic>
                   <pic:nvPicPr>
-                    <pic:cNvPr id="0" name="image2.png"/>
+                    <pic:cNvPr id="0" name="image3.png"/>
                     <pic:cNvPicPr preferRelativeResize="0"/>
                   </pic:nvPicPr>
                   <pic:blipFill>
@@ -564,6 +961,88 @@
     </w:p>
     <w:p>
       <w:pPr>
+        <w:spacing w:after="240" w:before="240" w:lineRule="auto"/>
+        <w:rPr/>
+      </w:pPr>
+      <w:r>
+        <w:rPr>
+          <w:b w:val="1"/>
+          <w:bCs w:val="1"/>
+          <w:rtl w:val="0"/>
+        </w:rPr>
+        <w:t xml:space="preserve">Explanation</w:t>
+      </w:r>
+      <w:r>
+        <w:rPr>
+          <w:rtl w:val="0"/>
+        </w:rPr>
+        <w:t xml:space="preserve">: The </w:t>
+      </w:r>
+      <w:r>
+        <w:rPr>
+          <w:rFonts w:ascii="Roboto Mono" w:cs="Roboto Mono" w:eastAsia="Roboto Mono" w:hAnsi="Roboto Mono"/>
+          <w:color w:val="188038"/>
+          <w:rtl w:val="0"/>
+        </w:rPr>
+        <w:t xml:space="preserve">grep</w:t>
+      </w:r>
+      <w:r>
+        <w:rPr>
+          <w:rtl w:val="0"/>
+        </w:rPr>
+        <w:t xml:space="preserve"> command searches for lines containing the word </w:t>
+      </w:r>
+      <w:r>
+        <w:rPr>
+          <w:rFonts w:ascii="Roboto Mono" w:cs="Roboto Mono" w:eastAsia="Roboto Mono" w:hAnsi="Roboto Mono"/>
+          <w:color w:val="188038"/>
+          <w:rtl w:val="0"/>
+        </w:rPr>
+        <w:t xml:space="preserve">root</w:t>
+      </w:r>
+      <w:r>
+        <w:rPr>
+          <w:rtl w:val="0"/>
+        </w:rPr>
+        <w:t xml:space="preserve"> in </w:t>
+      </w:r>
+      <w:r>
+        <w:rPr>
+          <w:rFonts w:ascii="Roboto Mono" w:cs="Roboto Mono" w:eastAsia="Roboto Mono" w:hAnsi="Roboto Mono"/>
+          <w:color w:val="188038"/>
+          <w:rtl w:val="0"/>
+        </w:rPr>
+        <w:t xml:space="preserve">/etc/passwd</w:t>
+      </w:r>
+      <w:r>
+        <w:rPr>
+          <w:rtl w:val="0"/>
+        </w:rPr>
+        <w:t xml:space="preserve">.</w:t>
+      </w:r>
+    </w:p>
+    <w:p>
+      <w:pPr>
+        <w:spacing w:after="240" w:before="240" w:lineRule="auto"/>
+        <w:rPr/>
+      </w:pPr>
+      <w:r>
+        <w:rPr>
+          <w:b w:val="1"/>
+          <w:bCs w:val="1"/>
+          <w:rtl w:val="0"/>
+        </w:rPr>
+        <w:t xml:space="preserve">Result</w:t>
+      </w:r>
+      <w:r>
+        <w:rPr>
+          <w:rtl w:val="0"/>
+        </w:rPr>
+        <w:t xml:space="preserve">: The terminal displays the lines that match the search pattern.</w:t>
+      </w:r>
+    </w:p>
+    <w:p>
+      <w:pPr>
         <w:spacing w:after="280" w:before="280" w:line="240" w:lineRule="auto"/>
         <w:rPr>
           <w:rFonts w:ascii="DM Sans" w:cs="DM Sans" w:eastAsia="DM Sans" w:hAnsi="DM Sans"/>
@@ -686,12 +1165,12 @@
           <wp:inline distB="114300" distT="114300" distL="114300" distR="114300">
             <wp:extent cx="5731200" cy="1638300"/>
             <wp:effectExtent b="0" l="0" r="0" t="0"/>
-            <wp:docPr id="3" name="image4.png"/>
+            <wp:docPr id="4" name="image5.png"/>
             <a:graphic>
               <a:graphicData uri="http://schemas.openxmlformats.org/drawingml/2006/picture">
                 <pic:pic>
                   <pic:nvPicPr>
-                    <pic:cNvPr id="0" name="image4.png"/>
+                    <pic:cNvPr id="0" name="image5.png"/>
                     <pic:cNvPicPr preferRelativeResize="0"/>
                   </pic:nvPicPr>
                   <pic:blipFill>
@@ -723,12 +1202,98 @@
     </w:p>
     <w:p>
       <w:pPr>
+        <w:spacing w:after="240" w:before="240" w:lineRule="auto"/>
         <w:rPr/>
       </w:pPr>
       <w:r>
         <w:rPr>
-          <w:rtl w:val="0"/>
-        </w:rPr>
+          <w:b w:val="1"/>
+          <w:bCs w:val="1"/>
+          <w:rtl w:val="0"/>
+        </w:rPr>
+        <w:t xml:space="preserve">Explanation</w:t>
+      </w:r>
+      <w:r>
+        <w:rPr>
+          <w:rtl w:val="0"/>
+        </w:rPr>
+        <w:t xml:space="preserve">: The </w:t>
+      </w:r>
+      <w:r>
+        <w:rPr>
+          <w:rFonts w:ascii="Roboto Mono" w:cs="Roboto Mono" w:eastAsia="Roboto Mono" w:hAnsi="Roboto Mono"/>
+          <w:color w:val="188038"/>
+          <w:rtl w:val="0"/>
+        </w:rPr>
+        <w:t xml:space="preserve">zip -r</w:t>
+      </w:r>
+      <w:r>
+        <w:rPr>
+          <w:rtl w:val="0"/>
+        </w:rPr>
+        <w:t xml:space="preserve"> command compresses the directory and its contents into </w:t>
+      </w:r>
+      <w:r>
+        <w:rPr>
+          <w:rFonts w:ascii="Roboto Mono" w:cs="Roboto Mono" w:eastAsia="Roboto Mono" w:hAnsi="Roboto Mono"/>
+          <w:color w:val="188038"/>
+          <w:rtl w:val="0"/>
+        </w:rPr>
+        <w:t xml:space="preserve">test_dir.zip</w:t>
+      </w:r>
+      <w:r>
+        <w:rPr>
+          <w:rtl w:val="0"/>
+        </w:rPr>
+        <w:t xml:space="preserve">. The </w:t>
+      </w:r>
+      <w:r>
+        <w:rPr>
+          <w:rFonts w:ascii="Roboto Mono" w:cs="Roboto Mono" w:eastAsia="Roboto Mono" w:hAnsi="Roboto Mono"/>
+          <w:color w:val="188038"/>
+          <w:rtl w:val="0"/>
+        </w:rPr>
+        <w:t xml:space="preserve">unzip</w:t>
+      </w:r>
+      <w:r>
+        <w:rPr>
+          <w:rtl w:val="0"/>
+        </w:rPr>
+        <w:t xml:space="preserve"> command extracts the archive into the specified </w:t>
+      </w:r>
+      <w:r>
+        <w:rPr>
+          <w:rFonts w:ascii="Roboto Mono" w:cs="Roboto Mono" w:eastAsia="Roboto Mono" w:hAnsi="Roboto Mono"/>
+          <w:color w:val="188038"/>
+          <w:rtl w:val="0"/>
+        </w:rPr>
+        <w:t xml:space="preserve">unzipped_dir</w:t>
+      </w:r>
+      <w:r>
+        <w:rPr>
+          <w:rtl w:val="0"/>
+        </w:rPr>
+        <w:t xml:space="preserve"> directory.</w:t>
+      </w:r>
+    </w:p>
+    <w:p>
+      <w:pPr>
+        <w:spacing w:after="240" w:before="240" w:lineRule="auto"/>
+        <w:rPr/>
+      </w:pPr>
+      <w:r>
+        <w:rPr>
+          <w:b w:val="1"/>
+          <w:bCs w:val="1"/>
+          <w:rtl w:val="0"/>
+        </w:rPr>
+        <w:t xml:space="preserve">Result</w:t>
+      </w:r>
+      <w:r>
+        <w:rPr>
+          <w:rtl w:val="0"/>
+        </w:rPr>
+        <w:t xml:space="preserve">: The directory contents are stored in a ZIP archive and extracted into a new location.</w:t>
       </w:r>
     </w:p>
     <w:p>
@@ -743,56 +1308,8 @@
         </w:rPr>
       </w:pPr>
       <w:r>
-        <w:rPr>
-          <w:rtl w:val="0"/>
-        </w:rPr>
-      </w:r>
-    </w:p>
-    <w:p>
-      <w:pPr>
-        <w:spacing w:after="280" w:before="280" w:line="240" w:lineRule="auto"/>
-        <w:rPr>
-          <w:rFonts w:ascii="DM Sans" w:cs="DM Sans" w:eastAsia="DM Sans" w:hAnsi="DM Sans"/>
-          <w:b w:val="1"/>
-          <w:bCs w:val="1"/>
-          <w:sz w:val="26"/>
-          <w:szCs w:val="26"/>
-        </w:rPr>
-      </w:pPr>
-      <w:r>
-        <w:rPr>
-          <w:rtl w:val="0"/>
-        </w:rPr>
-      </w:r>
-    </w:p>
-    <w:p>
-      <w:pPr>
-        <w:spacing w:after="280" w:before="280" w:line="240" w:lineRule="auto"/>
-        <w:rPr>
-          <w:rFonts w:ascii="DM Sans" w:cs="DM Sans" w:eastAsia="DM Sans" w:hAnsi="DM Sans"/>
-          <w:b w:val="1"/>
-          <w:bCs w:val="1"/>
-          <w:sz w:val="26"/>
-          <w:szCs w:val="26"/>
-        </w:rPr>
-      </w:pPr>
-      <w:r>
-        <w:rPr>
-          <w:rtl w:val="0"/>
-        </w:rPr>
-      </w:r>
-    </w:p>
-    <w:p>
-      <w:pPr>
-        <w:spacing w:after="280" w:before="280" w:line="240" w:lineRule="auto"/>
-        <w:rPr>
-          <w:rFonts w:ascii="DM Sans" w:cs="DM Sans" w:eastAsia="DM Sans" w:hAnsi="DM Sans"/>
-          <w:b w:val="1"/>
-          <w:bCs w:val="1"/>
-          <w:sz w:val="26"/>
-          <w:szCs w:val="26"/>
-        </w:rPr>
-      </w:pPr>
+        <w:br w:type="page"/>
+      </w:r>
       <w:r>
         <w:rPr>
           <w:rtl w:val="0"/>
@@ -880,7 +1397,7 @@
           <wp:inline distB="114300" distT="114300" distL="114300" distR="114300">
             <wp:extent cx="5731200" cy="1727200"/>
             <wp:effectExtent b="0" l="0" r="0" t="0"/>
-            <wp:docPr id="7" name="image1.png"/>
+            <wp:docPr id="8" name="image1.png"/>
             <a:graphic>
               <a:graphicData uri="http://schemas.openxmlformats.org/drawingml/2006/picture">
                 <pic:pic>
@@ -917,6 +1434,60 @@
     </w:p>
     <w:p>
       <w:pPr>
+        <w:spacing w:after="240" w:before="240" w:lineRule="auto"/>
+        <w:rPr/>
+      </w:pPr>
+      <w:r>
+        <w:rPr>
+          <w:b w:val="1"/>
+          <w:bCs w:val="1"/>
+          <w:rtl w:val="0"/>
+        </w:rPr>
+        <w:t xml:space="preserve">Explanation</w:t>
+      </w:r>
+      <w:r>
+        <w:rPr>
+          <w:rtl w:val="0"/>
+        </w:rPr>
+        <w:t xml:space="preserve">: The </w:t>
+      </w:r>
+      <w:r>
+        <w:rPr>
+          <w:rFonts w:ascii="Roboto Mono" w:cs="Roboto Mono" w:eastAsia="Roboto Mono" w:hAnsi="Roboto Mono"/>
+          <w:color w:val="188038"/>
+          <w:rtl w:val="0"/>
+        </w:rPr>
+        <w:t xml:space="preserve">wget</w:t>
+      </w:r>
+      <w:r>
+        <w:rPr>
+          <w:rtl w:val="0"/>
+        </w:rPr>
+        <w:t xml:space="preserve"> command downloads a file from a specified URL and saves it locally, provided the URL points to an accessible file.</w:t>
+      </w:r>
+    </w:p>
+    <w:p>
+      <w:pPr>
+        <w:spacing w:after="240" w:before="240" w:lineRule="auto"/>
+        <w:rPr/>
+      </w:pPr>
+      <w:r>
+        <w:rPr>
+          <w:b w:val="1"/>
+          <w:bCs w:val="1"/>
+          <w:rtl w:val="0"/>
+        </w:rPr>
+        <w:t xml:space="preserve">Result</w:t>
+      </w:r>
+      <w:r>
+        <w:rPr>
+          <w:rtl w:val="0"/>
+        </w:rPr>
+        <w:t xml:space="preserve">: The download completes if the URL is valid and the server provides the file.</w:t>
+      </w:r>
+    </w:p>
+    <w:p>
+      <w:pPr>
         <w:spacing w:after="280" w:before="280" w:line="240" w:lineRule="auto"/>
         <w:rPr>
           <w:rFonts w:ascii="DM Sans" w:cs="DM Sans" w:eastAsia="DM Sans" w:hAnsi="DM Sans"/>
@@ -985,19 +1556,19 @@
         <w:rPr/>
         <w:drawing>
           <wp:inline distB="114300" distT="114300" distL="114300" distR="114300">
-            <wp:extent cx="5731200" cy="3149600"/>
+            <wp:extent cx="5734050" cy="2305960"/>
             <wp:effectExtent b="0" l="0" r="0" t="0"/>
-            <wp:docPr id="2" name="image5.png"/>
+            <wp:docPr id="3" name="image8.png"/>
             <a:graphic>
               <a:graphicData uri="http://schemas.openxmlformats.org/drawingml/2006/picture">
                 <pic:pic>
                   <pic:nvPicPr>
-                    <pic:cNvPr id="0" name="image5.png"/>
+                    <pic:cNvPr id="0" name="image8.png"/>
                     <pic:cNvPicPr preferRelativeResize="0"/>
                   </pic:nvPicPr>
                   <pic:blipFill>
                     <a:blip r:embed="rId12"/>
-                    <a:srcRect b="0" l="0" r="0" t="0"/>
+                    <a:srcRect b="26859" l="0" r="0" t="0"/>
                     <a:stretch>
                       <a:fillRect/>
                     </a:stretch>
@@ -1005,7 +1576,7 @@
                   <pic:spPr>
                     <a:xfrm>
                       <a:off x="0" y="0"/>
-                      <a:ext cx="5731200" cy="3149600"/>
+                      <a:ext cx="5734050" cy="2305960"/>
                     </a:xfrm>
                     <a:prstGeom prst="rect"/>
                     <a:ln/>
@@ -1024,6 +1595,105 @@
     </w:p>
     <w:p>
       <w:pPr>
+        <w:rPr/>
+      </w:pPr>
+      <w:r>
+        <w:rPr/>
+        <w:drawing>
+          <wp:inline distB="114300" distT="114300" distL="114300" distR="114300">
+            <wp:extent cx="5731200" cy="1066800"/>
+            <wp:effectExtent b="0" l="0" r="0" t="0"/>
+            <wp:docPr id="2" name="image4.png"/>
+            <a:graphic>
+              <a:graphicData uri="http://schemas.openxmlformats.org/drawingml/2006/picture">
+                <pic:pic>
+                  <pic:nvPicPr>
+                    <pic:cNvPr id="0" name="image4.png"/>
+                    <pic:cNvPicPr preferRelativeResize="0"/>
+                  </pic:nvPicPr>
+                  <pic:blipFill>
+                    <a:blip r:embed="rId13"/>
+                    <a:srcRect b="0" l="0" r="0" t="0"/>
+                    <a:stretch>
+                      <a:fillRect/>
+                    </a:stretch>
+                  </pic:blipFill>
+                  <pic:spPr>
+                    <a:xfrm>
+                      <a:off x="0" y="0"/>
+                      <a:ext cx="5731200" cy="1066800"/>
+                    </a:xfrm>
+                    <a:prstGeom prst="rect"/>
+                    <a:ln/>
+                  </pic:spPr>
+                </pic:pic>
+              </a:graphicData>
+            </a:graphic>
+          </wp:inline>
+        </w:drawing>
+      </w:r>
+      <w:r>
+        <w:rPr>
+          <w:rtl w:val="0"/>
+        </w:rPr>
+      </w:r>
+    </w:p>
+    <w:p>
+      <w:pPr>
+        <w:spacing w:after="240" w:before="240" w:lineRule="auto"/>
+        <w:rPr/>
+      </w:pPr>
+      <w:r>
+        <w:rPr>
+          <w:b w:val="1"/>
+          <w:bCs w:val="1"/>
+          <w:rtl w:val="0"/>
+        </w:rPr>
+        <w:t xml:space="preserve">Explanation</w:t>
+      </w:r>
+      <w:r>
+        <w:rPr>
+          <w:rtl w:val="0"/>
+        </w:rPr>
+        <w:t xml:space="preserve">: The </w:t>
+      </w:r>
+      <w:r>
+        <w:rPr>
+          <w:rFonts w:ascii="Roboto Mono" w:cs="Roboto Mono" w:eastAsia="Roboto Mono" w:hAnsi="Roboto Mono"/>
+          <w:color w:val="188038"/>
+          <w:rtl w:val="0"/>
+        </w:rPr>
+        <w:t xml:space="preserve">chmod 444</w:t>
+      </w:r>
+      <w:r>
+        <w:rPr>
+          <w:rtl w:val="0"/>
+        </w:rPr>
+        <w:t xml:space="preserve"> command gives the file read permission to the owner, group, and others, while removing write and execute permissions.</w:t>
+      </w:r>
+    </w:p>
+    <w:p>
+      <w:pPr>
+        <w:spacing w:after="240" w:before="240" w:lineRule="auto"/>
+        <w:rPr/>
+      </w:pPr>
+      <w:r>
+        <w:rPr>
+          <w:b w:val="1"/>
+          <w:bCs w:val="1"/>
+          <w:rtl w:val="0"/>
+        </w:rPr>
+        <w:t xml:space="preserve">Result</w:t>
+      </w:r>
+      <w:r>
+        <w:rPr>
+          <w:rtl w:val="0"/>
+        </w:rPr>
+        <w:t xml:space="preserve">: The file becomes read-only according to its permission bits. Note that the file's owner or an administrator may still be able to change its permissions.</w:t>
+      </w:r>
+    </w:p>
+    <w:p>
+      <w:pPr>
         <w:spacing w:after="280" w:before="280" w:line="240" w:lineRule="auto"/>
         <w:rPr>
           <w:rFonts w:ascii="DM Sans" w:cs="DM Sans" w:eastAsia="DM Sans" w:hAnsi="DM Sans"/>
@@ -1035,79 +1705,11 @@
       </w:pPr>
       <w:r>
         <w:rPr>
-          <w:rtl w:val="0"/>
-        </w:rPr>
-      </w:r>
-    </w:p>
-    <w:p>
-      <w:pPr>
-        <w:spacing w:after="280" w:before="280" w:line="240" w:lineRule="auto"/>
-        <w:rPr>
           <w:rFonts w:ascii="DM Sans" w:cs="DM Sans" w:eastAsia="DM Sans" w:hAnsi="DM Sans"/>
           <w:b w:val="1"/>
           <w:bCs w:val="1"/>
           <w:sz w:val="26"/>
           <w:szCs w:val="26"/>
-        </w:rPr>
-      </w:pPr>
-      <w:r>
-        <w:rPr>
-          <w:rtl w:val="0"/>
-        </w:rPr>
-      </w:r>
-    </w:p>
-    <w:p>
-      <w:pPr>
-        <w:spacing w:after="280" w:before="280" w:line="240" w:lineRule="auto"/>
-        <w:rPr>
-          <w:rFonts w:ascii="DM Sans" w:cs="DM Sans" w:eastAsia="DM Sans" w:hAnsi="DM Sans"/>
-          <w:b w:val="1"/>
-          <w:bCs w:val="1"/>
-          <w:sz w:val="26"/>
-          <w:szCs w:val="26"/>
-        </w:rPr>
-      </w:pPr>
-      <w:r>
-        <w:rPr>
-          <w:rtl w:val="0"/>
-        </w:rPr>
-      </w:r>
-    </w:p>
-    <w:p>
-      <w:pPr>
-        <w:spacing w:after="280" w:before="280" w:line="240" w:lineRule="auto"/>
-        <w:rPr>
-          <w:rFonts w:ascii="DM Sans" w:cs="DM Sans" w:eastAsia="DM Sans" w:hAnsi="DM Sans"/>
-          <w:b w:val="1"/>
-          <w:bCs w:val="1"/>
-          <w:sz w:val="26"/>
-          <w:szCs w:val="26"/>
-        </w:rPr>
-      </w:pPr>
-      <w:r>
-        <w:rPr>
-          <w:rtl w:val="0"/>
-        </w:rPr>
-      </w:r>
-    </w:p>
-    <w:p>
-      <w:pPr>
-        <w:spacing w:after="280" w:before="280" w:line="240" w:lineRule="auto"/>
-        <w:rPr>
-          <w:rFonts w:ascii="DM Sans" w:cs="DM Sans" w:eastAsia="DM Sans" w:hAnsi="DM Sans"/>
-          <w:b w:val="1"/>
-          <w:bCs w:val="1"/>
-          <w:sz w:val="26"/>
-          <w:szCs w:val="26"/>
-        </w:rPr>
-      </w:pPr>
-      <w:r>
-        <w:rPr>
-          <w:rFonts w:ascii="DM Sans" w:cs="DM Sans" w:eastAsia="DM Sans" w:hAnsi="DM Sans"/>
-          <w:b w:val="1"/>
-          <w:bCs w:val="1"/>
-          <w:sz w:val="26"/>
-          <w:szCs w:val="26"/>
           <w:rtl w:val="0"/>
         </w:rPr>
         <w:t xml:space="preserve">7. Working with Environment Variables</w:t>
@@ -1117,7 +1719,7 @@
       <w:pPr>
         <w:numPr>
           <w:ilvl w:val="0"/>
-          <w:numId w:val="4"/>
+          <w:numId w:val="6"/>
         </w:numPr>
         <w:spacing w:after="280" w:before="280" w:line="240" w:lineRule="auto"/>
         <w:ind w:left="720" w:hanging="360"/>
@@ -1176,16 +1778,16 @@
           <wp:inline distB="114300" distT="114300" distL="114300" distR="114300">
             <wp:extent cx="5731200" cy="838200"/>
             <wp:effectExtent b="0" l="0" r="0" t="0"/>
-            <wp:docPr id="4" name="image3.png"/>
+            <wp:docPr id="5" name="image2.png"/>
             <a:graphic>
               <a:graphicData uri="http://schemas.openxmlformats.org/drawingml/2006/picture">
                 <pic:pic>
                   <pic:nvPicPr>
-                    <pic:cNvPr id="0" name="image3.png"/>
+                    <pic:cNvPr id="0" name="image2.png"/>
                     <pic:cNvPicPr preferRelativeResize="0"/>
                   </pic:nvPicPr>
                   <pic:blipFill>
-                    <a:blip r:embed="rId13"/>
+                    <a:blip r:embed="rId14"/>
                     <a:srcRect b="0" l="0" r="0" t="0"/>
                     <a:stretch>
                       <a:fillRect/>
@@ -1211,6 +1813,112 @@
         </w:rPr>
       </w:r>
     </w:p>
+    <w:p>
+      <w:pPr>
+        <w:spacing w:after="240" w:before="240" w:lineRule="auto"/>
+        <w:rPr/>
+      </w:pPr>
+      <w:r>
+        <w:rPr>
+          <w:b w:val="1"/>
+          <w:bCs w:val="1"/>
+          <w:rtl w:val="0"/>
+        </w:rPr>
+        <w:t xml:space="preserve">Explanation</w:t>
+      </w:r>
+      <w:r>
+        <w:rPr>
+          <w:rtl w:val="0"/>
+        </w:rPr>
+        <w:t xml:space="preserve">: The </w:t>
+      </w:r>
+      <w:r>
+        <w:rPr>
+          <w:rFonts w:ascii="Roboto Mono" w:cs="Roboto Mono" w:eastAsia="Roboto Mono" w:hAnsi="Roboto Mono"/>
+          <w:color w:val="188038"/>
+          <w:rtl w:val="0"/>
+        </w:rPr>
+        <w:t xml:space="preserve">export</w:t>
+      </w:r>
+      <w:r>
+        <w:rPr>
+          <w:rtl w:val="0"/>
+        </w:rPr>
+        <w:t xml:space="preserve"> command creates or updates the </w:t>
+      </w:r>
+      <w:r>
+        <w:rPr>
+          <w:rFonts w:ascii="Roboto Mono" w:cs="Roboto Mono" w:eastAsia="Roboto Mono" w:hAnsi="Roboto Mono"/>
+          <w:color w:val="188038"/>
+          <w:rtl w:val="0"/>
+        </w:rPr>
+        <w:t xml:space="preserve">MY_VAR</w:t>
+      </w:r>
+      <w:r>
+        <w:rPr>
+          <w:rtl w:val="0"/>
+        </w:rPr>
+        <w:t xml:space="preserve"> environment variable and makes it available to child processes launched from that shell. The </w:t>
+      </w:r>
+      <w:r>
+        <w:rPr>
+          <w:rFonts w:ascii="Roboto Mono" w:cs="Roboto Mono" w:eastAsia="Roboto Mono" w:hAnsi="Roboto Mono"/>
+          <w:color w:val="188038"/>
+          <w:rtl w:val="0"/>
+        </w:rPr>
+        <w:t xml:space="preserve">echo</w:t>
+      </w:r>
+      <w:r>
+        <w:rPr>
+          <w:rtl w:val="0"/>
+        </w:rPr>
+        <w:t xml:space="preserve"> command displays its value.</w:t>
+      </w:r>
+    </w:p>
+    <w:p>
+      <w:pPr>
+        <w:spacing w:after="240" w:before="240" w:lineRule="auto"/>
+        <w:rPr/>
+      </w:pPr>
+      <w:r>
+        <w:rPr>
+          <w:b w:val="1"/>
+          <w:bCs w:val="1"/>
+          <w:rtl w:val="0"/>
+        </w:rPr>
+        <w:t xml:space="preserve">Result</w:t>
+      </w:r>
+      <w:r>
+        <w:rPr>
+          <w:rtl w:val="0"/>
+        </w:rPr>
+        <w:t xml:space="preserve">: The terminal displays </w:t>
+      </w:r>
+      <w:r>
+        <w:rPr>
+          <w:rFonts w:ascii="Roboto Mono" w:cs="Roboto Mono" w:eastAsia="Roboto Mono" w:hAnsi="Roboto Mono"/>
+          <w:color w:val="188038"/>
+          <w:rtl w:val="0"/>
+        </w:rPr>
+        <w:t xml:space="preserve">Hello!</w:t>
+      </w:r>
+      <w:r>
+        <w:rPr>
+          <w:rtl w:val="0"/>
+        </w:rPr>
+        <w:t xml:space="preserve">, confirming that the variable has been set in the current shell.</w:t>
+      </w:r>
+    </w:p>
+    <w:p>
+      <w:pPr>
+        <w:rPr/>
+      </w:pPr>
+      <w:r>
+        <w:rPr>
+          <w:rtl w:val="0"/>
+        </w:rPr>
+      </w:r>
+    </w:p>
     <w:sectPr>
       <w:pgSz w:h="16834" w:w="11909" w:orient="portrait"/>
       <w:pgMar w:bottom="1440" w:top="1440" w:left="1440" w:right="1440" w:header="720" w:footer="720"/>
@@ -1555,8 +2263,8 @@
   <w:abstractNum w:abstractNumId="4">
     <w:lvl w:ilvl="0">
       <w:start w:val="1"/>
-      <w:numFmt w:val="decimal"/>
-      <w:lvlText w:val="%1."/>
+      <w:numFmt w:val="bullet"/>
+      <w:lvlText w:val="●"/>
       <w:lvlJc w:val="left"/>
       <w:pPr>
         <w:ind w:left="720" w:hanging="360"/>
@@ -1567,8 +2275,8 @@
     </w:lvl>
     <w:lvl w:ilvl="1">
       <w:start w:val="1"/>
-      <w:numFmt w:val="decimal"/>
-      <w:lvlText w:val="%2."/>
+      <w:numFmt w:val="bullet"/>
+      <w:lvlText w:val="○"/>
       <w:lvlJc w:val="left"/>
       <w:pPr>
         <w:ind w:left="1440" w:hanging="360"/>
@@ -1579,8 +2287,8 @@
     </w:lvl>
     <w:lvl w:ilvl="2">
       <w:start w:val="1"/>
-      <w:numFmt w:val="decimal"/>
-      <w:lvlText w:val="%3."/>
+      <w:numFmt w:val="bullet"/>
+      <w:lvlText w:val="■"/>
       <w:lvlJc w:val="left"/>
       <w:pPr>
         <w:ind w:left="2160" w:hanging="360"/>
@@ -1591,8 +2299,8 @@
     </w:lvl>
     <w:lvl w:ilvl="3">
       <w:start w:val="1"/>
-      <w:numFmt w:val="decimal"/>
-      <w:lvlText w:val="%4."/>
+      <w:numFmt w:val="bullet"/>
+      <w:lvlText w:val="●"/>
       <w:lvlJc w:val="left"/>
       <w:pPr>
         <w:ind w:left="2880" w:hanging="360"/>
@@ -1603,8 +2311,8 @@
     </w:lvl>
     <w:lvl w:ilvl="4">
       <w:start w:val="1"/>
-      <w:numFmt w:val="decimal"/>
-      <w:lvlText w:val="%5."/>
+      <w:numFmt w:val="bullet"/>
+      <w:lvlText w:val="○"/>
       <w:lvlJc w:val="left"/>
       <w:pPr>
         <w:ind w:left="3600" w:hanging="360"/>
@@ -1615,8 +2323,8 @@
     </w:lvl>
     <w:lvl w:ilvl="5">
       <w:start w:val="1"/>
-      <w:numFmt w:val="decimal"/>
-      <w:lvlText w:val="%6."/>
+      <w:numFmt w:val="bullet"/>
+      <w:lvlText w:val="■"/>
       <w:lvlJc w:val="left"/>
       <w:pPr>
         <w:ind w:left="4320" w:hanging="360"/>
@@ -1627,8 +2335,8 @@
     </w:lvl>
     <w:lvl w:ilvl="6">
       <w:start w:val="1"/>
-      <w:numFmt w:val="decimal"/>
-      <w:lvlText w:val="%7."/>
+      <w:numFmt w:val="bullet"/>
+      <w:lvlText w:val="●"/>
       <w:lvlJc w:val="left"/>
       <w:pPr>
         <w:ind w:left="5040" w:hanging="360"/>
@@ -1639,8 +2347,8 @@
     </w:lvl>
     <w:lvl w:ilvl="7">
       <w:start w:val="1"/>
-      <w:numFmt w:val="decimal"/>
-      <w:lvlText w:val="%8."/>
+      <w:numFmt w:val="bullet"/>
+      <w:lvlText w:val="○"/>
       <w:lvlJc w:val="left"/>
       <w:pPr>
         <w:ind w:left="5760" w:hanging="360"/>
@@ -1651,8 +2359,8 @@
     </w:lvl>
     <w:lvl w:ilvl="8">
       <w:start w:val="1"/>
-      <w:numFmt w:val="decimal"/>
-      <w:lvlText w:val="%9."/>
+      <w:numFmt w:val="bullet"/>
+      <w:lvlText w:val="■"/>
       <w:lvlJc w:val="left"/>
       <w:pPr>
         <w:ind w:left="6480" w:hanging="360"/>
@@ -1665,8 +2373,8 @@
   <w:abstractNum w:abstractNumId="5">
     <w:lvl w:ilvl="0">
       <w:start w:val="1"/>
-      <w:numFmt w:val="decimal"/>
-      <w:lvlText w:val="%1."/>
+      <w:numFmt w:val="bullet"/>
+      <w:lvlText w:val="●"/>
       <w:lvlJc w:val="left"/>
       <w:pPr>
         <w:ind w:left="720" w:hanging="360"/>
@@ -1677,8 +2385,8 @@
     </w:lvl>
     <w:lvl w:ilvl="1">
       <w:start w:val="1"/>
-      <w:numFmt w:val="decimal"/>
-      <w:lvlText w:val="%2."/>
+      <w:numFmt w:val="bullet"/>
+      <w:lvlText w:val="○"/>
       <w:lvlJc w:val="left"/>
       <w:pPr>
         <w:ind w:left="1440" w:hanging="360"/>
@@ -1689,8 +2397,8 @@
     </w:lvl>
     <w:lvl w:ilvl="2">
       <w:start w:val="1"/>
-      <w:numFmt w:val="decimal"/>
-      <w:lvlText w:val="%3."/>
+      <w:numFmt w:val="bullet"/>
+      <w:lvlText w:val="■"/>
       <w:lvlJc w:val="left"/>
       <w:pPr>
         <w:ind w:left="2160" w:hanging="360"/>
@@ -1701,8 +2409,8 @@
     </w:lvl>
     <w:lvl w:ilvl="3">
       <w:start w:val="1"/>
-      <w:numFmt w:val="decimal"/>
-      <w:lvlText w:val="%4."/>
+      <w:numFmt w:val="bullet"/>
+      <w:lvlText w:val="●"/>
       <w:lvlJc w:val="left"/>
       <w:pPr>
         <w:ind w:left="2880" w:hanging="360"/>
@@ -1713,8 +2421,8 @@
     </w:lvl>
     <w:lvl w:ilvl="4">
       <w:start w:val="1"/>
-      <w:numFmt w:val="decimal"/>
-      <w:lvlText w:val="%5."/>
+      <w:numFmt w:val="bullet"/>
+      <w:lvlText w:val="○"/>
       <w:lvlJc w:val="left"/>
       <w:pPr>
         <w:ind w:left="3600" w:hanging="360"/>
@@ -1725,8 +2433,8 @@
     </w:lvl>
     <w:lvl w:ilvl="5">
       <w:start w:val="1"/>
-      <w:numFmt w:val="decimal"/>
-      <w:lvlText w:val="%6."/>
+      <w:numFmt w:val="bullet"/>
+      <w:lvlText w:val="■"/>
       <w:lvlJc w:val="left"/>
       <w:pPr>
         <w:ind w:left="4320" w:hanging="360"/>
@@ -1737,8 +2445,8 @@
     </w:lvl>
     <w:lvl w:ilvl="6">
       <w:start w:val="1"/>
-      <w:numFmt w:val="decimal"/>
-      <w:lvlText w:val="%7."/>
+      <w:numFmt w:val="bullet"/>
+      <w:lvlText w:val="●"/>
       <w:lvlJc w:val="left"/>
       <w:pPr>
         <w:ind w:left="5040" w:hanging="360"/>
@@ -1749,8 +2457,8 @@
     </w:lvl>
     <w:lvl w:ilvl="7">
       <w:start w:val="1"/>
-      <w:numFmt w:val="decimal"/>
-      <w:lvlText w:val="%8."/>
+      <w:numFmt w:val="bullet"/>
+      <w:lvlText w:val="○"/>
       <w:lvlJc w:val="left"/>
       <w:pPr>
         <w:ind w:left="5760" w:hanging="360"/>
@@ -1761,8 +2469,8 @@
     </w:lvl>
     <w:lvl w:ilvl="8">
       <w:start w:val="1"/>
-      <w:numFmt w:val="decimal"/>
-      <w:lvlText w:val="%9."/>
+      <w:numFmt w:val="bullet"/>
+      <w:lvlText w:val="■"/>
       <w:lvlJc w:val="left"/>
       <w:pPr>
         <w:ind w:left="6480" w:hanging="360"/>
@@ -1883,6 +2591,226 @@
     </w:lvl>
   </w:abstractNum>
   <w:abstractNum w:abstractNumId="7">
+    <w:lvl w:ilvl="0">
+      <w:start w:val="1"/>
+      <w:numFmt w:val="decimal"/>
+      <w:lvlText w:val="%1."/>
+      <w:lvlJc w:val="left"/>
+      <w:pPr>
+        <w:ind w:left="720" w:hanging="360"/>
+      </w:pPr>
+      <w:rPr>
+        <w:u w:val="none"/>
+      </w:rPr>
+    </w:lvl>
+    <w:lvl w:ilvl="1">
+      <w:start w:val="1"/>
+      <w:numFmt w:val="decimal"/>
+      <w:lvlText w:val="%2."/>
+      <w:lvlJc w:val="left"/>
+      <w:pPr>
+        <w:ind w:left="1440" w:hanging="360"/>
+      </w:pPr>
+      <w:rPr>
+        <w:u w:val="none"/>
+      </w:rPr>
+    </w:lvl>
+    <w:lvl w:ilvl="2">
+      <w:start w:val="1"/>
+      <w:numFmt w:val="decimal"/>
+      <w:lvlText w:val="%3."/>
+      <w:lvlJc w:val="left"/>
+      <w:pPr>
+        <w:ind w:left="2160" w:hanging="360"/>
+      </w:pPr>
+      <w:rPr>
+        <w:u w:val="none"/>
+      </w:rPr>
+    </w:lvl>
+    <w:lvl w:ilvl="3">
+      <w:start w:val="1"/>
+      <w:numFmt w:val="decimal"/>
+      <w:lvlText w:val="%4."/>
+      <w:lvlJc w:val="left"/>
+      <w:pPr>
+        <w:ind w:left="2880" w:hanging="360"/>
+      </w:pPr>
+      <w:rPr>
+        <w:u w:val="none"/>
+      </w:rPr>
+    </w:lvl>
+    <w:lvl w:ilvl="4">
+      <w:start w:val="1"/>
+      <w:numFmt w:val="decimal"/>
+      <w:lvlText w:val="%5."/>
+      <w:lvlJc w:val="left"/>
+      <w:pPr>
+        <w:ind w:left="3600" w:hanging="360"/>
+      </w:pPr>
+      <w:rPr>
+        <w:u w:val="none"/>
+      </w:rPr>
+    </w:lvl>
+    <w:lvl w:ilvl="5">
+      <w:start w:val="1"/>
+      <w:numFmt w:val="decimal"/>
+      <w:lvlText w:val="%6."/>
+      <w:lvlJc w:val="left"/>
+      <w:pPr>
+        <w:ind w:left="4320" w:hanging="360"/>
+      </w:pPr>
+      <w:rPr>
+        <w:u w:val="none"/>
+      </w:rPr>
+    </w:lvl>
+    <w:lvl w:ilvl="6">
+      <w:start w:val="1"/>
+      <w:numFmt w:val="decimal"/>
+      <w:lvlText w:val="%7."/>
+      <w:lvlJc w:val="left"/>
+      <w:pPr>
+        <w:ind w:left="5040" w:hanging="360"/>
+      </w:pPr>
+      <w:rPr>
+        <w:u w:val="none"/>
+      </w:rPr>
+    </w:lvl>
+    <w:lvl w:ilvl="7">
+      <w:start w:val="1"/>
+      <w:numFmt w:val="decimal"/>
+      <w:lvlText w:val="%8."/>
+      <w:lvlJc w:val="left"/>
+      <w:pPr>
+        <w:ind w:left="5760" w:hanging="360"/>
+      </w:pPr>
+      <w:rPr>
+        <w:u w:val="none"/>
+      </w:rPr>
+    </w:lvl>
+    <w:lvl w:ilvl="8">
+      <w:start w:val="1"/>
+      <w:numFmt w:val="decimal"/>
+      <w:lvlText w:val="%9."/>
+      <w:lvlJc w:val="left"/>
+      <w:pPr>
+        <w:ind w:left="6480" w:hanging="360"/>
+      </w:pPr>
+      <w:rPr>
+        <w:u w:val="none"/>
+      </w:rPr>
+    </w:lvl>
+  </w:abstractNum>
+  <w:abstractNum w:abstractNumId="8">
+    <w:lvl w:ilvl="0">
+      <w:start w:val="1"/>
+      <w:numFmt w:val="decimal"/>
+      <w:lvlText w:val="%1."/>
+      <w:lvlJc w:val="left"/>
+      <w:pPr>
+        <w:ind w:left="720" w:hanging="360"/>
+      </w:pPr>
+      <w:rPr>
+        <w:u w:val="none"/>
+      </w:rPr>
+    </w:lvl>
+    <w:lvl w:ilvl="1">
+      <w:start w:val="1"/>
+      <w:numFmt w:val="decimal"/>
+      <w:lvlText w:val="%2."/>
+      <w:lvlJc w:val="left"/>
+      <w:pPr>
+        <w:ind w:left="1440" w:hanging="360"/>
+      </w:pPr>
+      <w:rPr>
+        <w:u w:val="none"/>
+      </w:rPr>
+    </w:lvl>
+    <w:lvl w:ilvl="2">
+      <w:start w:val="1"/>
+      <w:numFmt w:val="decimal"/>
+      <w:lvlText w:val="%3."/>
+      <w:lvlJc w:val="left"/>
+      <w:pPr>
+        <w:ind w:left="2160" w:hanging="360"/>
+      </w:pPr>
+      <w:rPr>
+        <w:u w:val="none"/>
+      </w:rPr>
+    </w:lvl>
+    <w:lvl w:ilvl="3">
+      <w:start w:val="1"/>
+      <w:numFmt w:val="decimal"/>
+      <w:lvlText w:val="%4."/>
+      <w:lvlJc w:val="left"/>
+      <w:pPr>
+        <w:ind w:left="2880" w:hanging="360"/>
+      </w:pPr>
+      <w:rPr>
+        <w:u w:val="none"/>
+      </w:rPr>
+    </w:lvl>
+    <w:lvl w:ilvl="4">
+      <w:start w:val="1"/>
+      <w:numFmt w:val="decimal"/>
+      <w:lvlText w:val="%5."/>
+      <w:lvlJc w:val="left"/>
+      <w:pPr>
+        <w:ind w:left="3600" w:hanging="360"/>
+      </w:pPr>
+      <w:rPr>
+        <w:u w:val="none"/>
+      </w:rPr>
+    </w:lvl>
+    <w:lvl w:ilvl="5">
+      <w:start w:val="1"/>
+      <w:numFmt w:val="decimal"/>
+      <w:lvlText w:val="%6."/>
+      <w:lvlJc w:val="left"/>
+      <w:pPr>
+        <w:ind w:left="4320" w:hanging="360"/>
+      </w:pPr>
+      <w:rPr>
+        <w:u w:val="none"/>
+      </w:rPr>
+    </w:lvl>
+    <w:lvl w:ilvl="6">
+      <w:start w:val="1"/>
+      <w:numFmt w:val="decimal"/>
+      <w:lvlText w:val="%7."/>
+      <w:lvlJc w:val="left"/>
+      <w:pPr>
+        <w:ind w:left="5040" w:hanging="360"/>
+      </w:pPr>
+      <w:rPr>
+        <w:u w:val="none"/>
+      </w:rPr>
+    </w:lvl>
+    <w:lvl w:ilvl="7">
+      <w:start w:val="1"/>
+      <w:numFmt w:val="decimal"/>
+      <w:lvlText w:val="%8."/>
+      <w:lvlJc w:val="left"/>
+      <w:pPr>
+        <w:ind w:left="5760" w:hanging="360"/>
+      </w:pPr>
+      <w:rPr>
+        <w:u w:val="none"/>
+      </w:rPr>
+    </w:lvl>
+    <w:lvl w:ilvl="8">
+      <w:start w:val="1"/>
+      <w:numFmt w:val="decimal"/>
+      <w:lvlText w:val="%9."/>
+      <w:lvlJc w:val="left"/>
+      <w:pPr>
+        <w:ind w:left="6480" w:hanging="360"/>
+      </w:pPr>
+      <w:rPr>
+        <w:u w:val="none"/>
+      </w:rPr>
+    </w:lvl>
+  </w:abstractNum>
+  <w:abstractNum w:abstractNumId="9">
     <w:lvl w:ilvl="0">
       <w:start w:val="1"/>
       <w:numFmt w:val="decimal"/>
@@ -2012,6 +2940,12 @@
   </w:num>
   <w:num w:numId="7">
     <w:abstractNumId w:val="7"/>
+  </w:num>
+  <w:num w:numId="8">
+    <w:abstractNumId w:val="8"/>
+  </w:num>
+  <w:num w:numId="9">
+    <w:abstractNumId w:val="9"/>
   </w:num>
 </w:numbering>
 </file>

</xml_diff>